<commit_message>
update Production&Business + creation file Son&efetssonores
</commit_message>
<xml_diff>
--- a/Production & Business.docx
+++ b/Production & Business.docx
@@ -16,79 +16,95 @@
           <w:bCs/>
           <w:u w:val="single"/>
         </w:rPr>
-        <w:t xml:space="preserve">PARTIE </w:t>
-      </w:r>
-      <w:r>
+        <w:t>PARTIE MIXTE</w:t>
+      </w:r>
+    </w:p>
+    <w:p>
+      <w:pPr>
         <w:rPr>
           <w:b/>
           <w:bCs/>
-          <w:u w:val="single"/>
-        </w:rPr>
-        <w:t>MIXTE</w:t>
-      </w:r>
-    </w:p>
-    <w:p>
-      <w:pPr>
+        </w:rPr>
+      </w:pPr>
+      <w:r>
         <w:rPr>
           <w:b/>
           <w:bCs/>
         </w:rPr>
-      </w:pPr>
+        <w:t>Gameplay secondaires</w:t>
+      </w:r>
+    </w:p>
+    <w:p>
+      <w:r>
+        <w:t>Le joueur pourra utiliser plusieurs types de gameplays secondaires, qui varieront en fonction des mini-jeux proposés. Ceux-ci se déclencheront lors de certaines interactions avec les commerçants ou les éléments du marché.</w:t>
+      </w:r>
+    </w:p>
+    <w:p>
+      <w:r>
+        <w:t xml:space="preserve"> -</w:t>
+      </w:r>
+      <w:r>
+        <w:t>Pesée des fruits et légumes : un curseur se déplace sur une balance. Le joueur doit appuyer sur une touche au moment où le curseur atteint la zone colorée afin de réussir la pesée.</w:t>
+      </w:r>
+    </w:p>
+    <w:p>
+      <w:r>
+        <w:t>-</w:t>
+      </w:r>
+      <w:r>
+        <w:t>Boulanger : le boulanger propose au joueur une sélection de trois pains. Celui-ci doit cliquer sur le bon pain parmi les trois choix proposés : pain traditionnel, pain</w:t>
+      </w:r>
+      <w:r>
+        <w:t xml:space="preserve"> de campagne</w:t>
+      </w:r>
+      <w:r>
+        <w:t xml:space="preserve"> et pain </w:t>
+      </w:r>
+      <w:r>
+        <w:t>de mie</w:t>
+      </w:r>
+      <w:r>
+        <w:t>.</w:t>
+      </w:r>
+    </w:p>
+    <w:p>
+      <w:r>
+        <w:t>-</w:t>
+      </w:r>
+      <w:r>
+        <w:t>Poissonnier : le joueur doit attraper un poisson à la main dans un aquarium où plusieurs animaux aquatiques se déplacent</w:t>
+      </w:r>
+      <w:r>
+        <w:t xml:space="preserve"> rapidement</w:t>
+      </w:r>
+      <w:r>
+        <w:t xml:space="preserve">. Il doit sélectionner le bon animal parmi trois possibilités : crabe, </w:t>
+      </w:r>
+      <w:r>
+        <w:t>espadon</w:t>
+      </w:r>
+      <w:r>
+        <w:t xml:space="preserve"> et </w:t>
+      </w:r>
+      <w:r>
+        <w:t>huitre</w:t>
+      </w:r>
+      <w:r>
+        <w:t>. S'il sélectionne le mauvais animal</w:t>
+      </w:r>
+      <w:r>
+        <w:t xml:space="preserve"> ou le rate</w:t>
+      </w:r>
+      <w:r>
+        <w:t>, le joueur est étourdi pendant quelques secondes.</w:t>
+      </w:r>
+    </w:p>
+    <w:p>
       <w:r>
         <w:rPr>
           <w:b/>
           <w:bCs/>
         </w:rPr>
-        <w:t>Gameplay secondaires</w:t>
-      </w:r>
-    </w:p>
-    <w:p>
-      <w:r>
-        <w:t>Le joueur pourra utiliser plusieurs types de gameplays secondaires, qui varieront en fonction des mini-jeux proposés. Ceux-ci se déclencheront lors de certaines interactions avec les commerçants ou les éléments du marché.</w:t>
-      </w:r>
-    </w:p>
-    <w:p>
-      <w:r>
-        <w:t xml:space="preserve"> -</w:t>
-      </w:r>
-      <w:r>
-        <w:t>Pesée des fruits et légumes : un curseur se déplace sur une balance. Le joueur doit appuyer sur une touche au moment où le curseur atteint la zone colorée afin de réussir la pesée.</w:t>
-      </w:r>
-    </w:p>
-    <w:p>
-      <w:r>
-        <w:t>-</w:t>
-      </w:r>
-      <w:r>
-        <w:t>Boulanger : le boulanger propose au joueur une sélection de trois pains. Celui-ci doit cliquer sur le bon pain parmi les trois choix proposés : pain traditionnel, pain aux céréales et pain au pavot.</w:t>
-      </w:r>
-    </w:p>
-    <w:p>
-      <w:r>
-        <w:t>-</w:t>
-      </w:r>
-      <w:r>
-        <w:t>Poissonnier : le joueur doit attraper un poisson à la main dans un aquarium où plusieurs animaux aquatiques se déplacent</w:t>
-      </w:r>
-      <w:r>
-        <w:t xml:space="preserve"> rapidement</w:t>
-      </w:r>
-      <w:r>
-        <w:t>. Il doit sélectionner le bon animal parmi trois possibilités : crabe, langoustine et poisson-lune. S'il sélectionne le mauvais animal</w:t>
-      </w:r>
-      <w:r>
-        <w:t xml:space="preserve"> ou le rate</w:t>
-      </w:r>
-      <w:r>
-        <w:t>, le joueur est étourdi pendant quelques secondes.</w:t>
-      </w:r>
-    </w:p>
-    <w:p>
-      <w:r>
-        <w:rPr>
-          <w:b/>
-          <w:bCs/>
-        </w:rPr>
         <w:t xml:space="preserve">Objectif par niveau </w:t>
       </w:r>
     </w:p>
@@ -99,45 +115,27 @@
     </w:p>
     <w:p>
       <w:r>
-        <w:t>-</w:t>
-      </w:r>
-      <w:r>
-        <w:t>Entrée du supermarché : point d’apparition des joueurs au lancement de la partie.</w:t>
-      </w:r>
-    </w:p>
-    <w:p>
-      <w:r>
-        <w:t>-</w:t>
-      </w:r>
-      <w:r>
-        <w:t>Boulangerie : point d’interaction permettant au joueur d’accéder au mini-jeu de la boulangerie.</w:t>
-      </w:r>
-    </w:p>
-    <w:p>
-      <w:r>
-        <w:t>-</w:t>
-      </w:r>
-      <w:r>
-        <w:t>Poissonnerie : point d’interaction permettant au joueur d’accéder au mini-jeu de la poissonnerie.</w:t>
-      </w:r>
-    </w:p>
-    <w:p>
-      <w:r>
-        <w:t>-</w:t>
-      </w:r>
-      <w:r>
-        <w:t>Pesée des fruits et légumes : point d’interaction permettant au joueur d’accéder au mini-jeu de pesée des fruits et légumes.</w:t>
-      </w:r>
-      <w:r>
-        <w:t xml:space="preserve"> Utilisable seulement si un fruit est sélectionné par le joueur.</w:t>
-      </w:r>
-    </w:p>
-    <w:p>
-      <w:r>
-        <w:t>-</w:t>
-      </w:r>
-      <w:r>
-        <w:t>Caisse de paiement : point d’interaction permettant au joueur de valider sa liste de courses une fois celle-ci entièrement complétée.</w:t>
+        <w:t>-Entrée du supermarché : point d’apparition des joueurs au lancement de la partie.</w:t>
+      </w:r>
+    </w:p>
+    <w:p>
+      <w:r>
+        <w:t>-Boulangerie : point d’interaction permettant au joueur d’accéder au mini-jeu de la boulangerie.</w:t>
+      </w:r>
+    </w:p>
+    <w:p>
+      <w:r>
+        <w:t>-Poissonnerie : point d’interaction permettant au joueur d’accéder au mini-jeu de la poissonnerie.</w:t>
+      </w:r>
+    </w:p>
+    <w:p>
+      <w:r>
+        <w:t>-Pesée des fruits et légumes : point d’interaction permettant au joueur d’accéder au mini-jeu de pesée des fruits et légumes. Utilisable seulement si un fruit est sélectionné par le joueur.</w:t>
+      </w:r>
+    </w:p>
+    <w:p>
+      <w:r>
+        <w:t>-Caisse de paiement : point d’interaction permettant au joueur de valider sa liste de courses une fois celle-ci entièrement complétée.</w:t>
       </w:r>
     </w:p>
     <w:p>
@@ -495,13 +493,7 @@
         </w:numPr>
       </w:pPr>
       <w:r>
-        <w:t xml:space="preserve">Habitudes de jeu : Camille joue régulièrement sur PC et console. Elle apprécie une grande variété de jeux vidéo, allant des JRPG </w:t>
-      </w:r>
-      <w:r>
-        <w:t>aux jeux solos</w:t>
-      </w:r>
-      <w:r>
-        <w:t xml:space="preserve">. Elle aime également particulièrement les party </w:t>
+        <w:t xml:space="preserve">Habitudes de jeu : Camille joue régulièrement sur PC et console. Elle apprécie une grande variété de jeux vidéo, allant des JRPG aux jeux solos. Elle aime également particulièrement les party </w:t>
       </w:r>
       <w:proofErr w:type="spellStart"/>
       <w:r>
@@ -1221,12 +1213,6 @@
         <w:gridCol w:w="4389"/>
       </w:tblGrid>
       <w:tr>
-        <w:tblPrEx>
-          <w:tblCellMar>
-            <w:top w:w="0" w:type="dxa"/>
-            <w:bottom w:w="0" w:type="dxa"/>
-          </w:tblCellMar>
-        </w:tblPrEx>
         <w:trPr>
           <w:trHeight w:val="708"/>
         </w:trPr>
@@ -1295,12 +1281,6 @@
         </w:tc>
       </w:tr>
       <w:tr>
-        <w:tblPrEx>
-          <w:tblCellMar>
-            <w:top w:w="0" w:type="dxa"/>
-            <w:bottom w:w="0" w:type="dxa"/>
-          </w:tblCellMar>
-        </w:tblPrEx>
         <w:trPr>
           <w:trHeight w:val="2653"/>
         </w:trPr>
@@ -1438,12 +1418,6 @@
         </w:tc>
       </w:tr>
       <w:tr>
-        <w:tblPrEx>
-          <w:tblCellMar>
-            <w:top w:w="0" w:type="dxa"/>
-            <w:bottom w:w="0" w:type="dxa"/>
-          </w:tblCellMar>
-        </w:tblPrEx>
         <w:trPr>
           <w:trHeight w:val="2119"/>
         </w:trPr>
@@ -1484,14 +1458,7 @@
                 <w:b/>
                 <w:bCs/>
               </w:rPr>
-              <w:t xml:space="preserve">PAS </w:t>
-            </w:r>
-            <w:r>
-              <w:rPr>
-                <w:b/>
-                <w:bCs/>
-              </w:rPr>
-              <w:t>IMPORTANT</w:t>
+              <w:t>PAS IMPORTANT</w:t>
             </w:r>
           </w:p>
           <w:p>
@@ -1530,10 +1497,7 @@
               <w:spacing w:after="0"/>
             </w:pPr>
             <w:r>
-              <w:t>-</w:t>
-            </w:r>
-            <w:r>
-              <w:t>création de l’environnement</w:t>
+              <w:t>-création de l’environnement</w:t>
             </w:r>
             <w:r>
               <w:t xml:space="preserve"> 3D</w:t>
@@ -2072,7 +2036,6 @@
         <w:t xml:space="preserve">, </w:t>
       </w:r>
       <w:proofErr w:type="spellStart"/>
-      <w:proofErr w:type="gramStart"/>
       <w:r>
         <w:rPr>
           <w:i/>
@@ -2089,11 +2052,7 @@
         <w:t>!</w:t>
       </w:r>
       <w:r>
-        <w:t>,</w:t>
-      </w:r>
-      <w:proofErr w:type="gramEnd"/>
-      <w:r>
-        <w:t xml:space="preserve"> </w:t>
+        <w:t xml:space="preserve">, </w:t>
       </w:r>
       <w:r>
         <w:rPr>
@@ -2160,15 +2119,7 @@
         <w:t xml:space="preserve">, Instagram et YouTube pourraient mettre en scène </w:t>
       </w:r>
       <w:r>
-        <w:t xml:space="preserve">du </w:t>
-      </w:r>
-      <w:proofErr w:type="gramStart"/>
-      <w:r>
-        <w:t>gameplay  du</w:t>
-      </w:r>
-      <w:proofErr w:type="gramEnd"/>
-      <w:r>
-        <w:t xml:space="preserve"> jeu avec </w:t>
+        <w:t xml:space="preserve">du gameplay  du jeu avec </w:t>
       </w:r>
       <w:r>
         <w:t xml:space="preserve">des affrontements entre des joueurs, avec une </w:t>
@@ -2405,29 +2356,13 @@
           <w:iCs/>
           <w:lang w:val="en-US"/>
         </w:rPr>
-        <w:t xml:space="preserve">Plate </w:t>
-      </w:r>
-      <w:proofErr w:type="gramStart"/>
-      <w:r>
-        <w:rPr>
-          <w:i/>
-          <w:iCs/>
+        <w:t>Plate Up!</w:t>
+      </w:r>
+      <w:r>
+        <w:rPr>
           <w:lang w:val="en-US"/>
         </w:rPr>
-        <w:t>Up!</w:t>
-      </w:r>
-      <w:r>
-        <w:rPr>
-          <w:lang w:val="en-US"/>
-        </w:rPr>
-        <w:t>,</w:t>
-      </w:r>
-      <w:proofErr w:type="gramEnd"/>
-      <w:r>
-        <w:rPr>
-          <w:lang w:val="en-US"/>
-        </w:rPr>
-        <w:t xml:space="preserve"> </w:t>
+        <w:t xml:space="preserve">, </w:t>
       </w:r>
       <w:r>
         <w:rPr>
@@ -2585,15 +2520,7 @@
                                     </w:drawing>
                                   </w:r>
                                   <w:r>
-                                    <w:t xml:space="preserve">Figure </w:t>
-                                  </w:r>
-                                  <w:proofErr w:type="gramStart"/>
-                                  <w:r>
-                                    <w:t>1:</w:t>
-                                  </w:r>
-                                  <w:proofErr w:type="gramEnd"/>
-                                  <w:r>
-                                    <w:t xml:space="preserve"> </w:t>
+                                    <w:t xml:space="preserve">Figure 1: </w:t>
                                   </w:r>
                                   <w:proofErr w:type="spellStart"/>
                                   <w:r>
@@ -2679,15 +2606,7 @@
                               </w:drawing>
                             </w:r>
                             <w:r>
-                              <w:t xml:space="preserve">Figure </w:t>
-                            </w:r>
-                            <w:proofErr w:type="gramStart"/>
-                            <w:r>
-                              <w:t>1:</w:t>
-                            </w:r>
-                            <w:proofErr w:type="gramEnd"/>
-                            <w:r>
-                              <w:t xml:space="preserve"> </w:t>
+                              <w:t xml:space="preserve">Figure 1: </w:t>
                             </w:r>
                             <w:proofErr w:type="spellStart"/>
                             <w:r>
@@ -2820,23 +2739,7 @@
                                     </w:drawing>
                                   </w:r>
                                   <w:r>
-                                    <w:t xml:space="preserve">Figure </w:t>
-                                  </w:r>
-                                  <w:proofErr w:type="gramStart"/>
-                                  <w:r>
-                                    <w:t>2:</w:t>
-                                  </w:r>
-                                  <w:proofErr w:type="gramEnd"/>
-                                  <w:r>
-                                    <w:t xml:space="preserve"> Plate Up ! (</w:t>
-                                  </w:r>
-                                  <w:proofErr w:type="gramStart"/>
-                                  <w:r>
-                                    <w:t>environ</w:t>
-                                  </w:r>
-                                  <w:proofErr w:type="gramEnd"/>
-                                  <w:r>
-                                    <w:t xml:space="preserve"> 1 million de copies vendus)</w:t>
+                                    <w:t>Figure 2: Plate Up ! (environ 1 million de copies vendus)</w:t>
                                   </w:r>
                                 </w:p>
                               </w:txbxContent>
@@ -2910,23 +2813,7 @@
                               </w:drawing>
                             </w:r>
                             <w:r>
-                              <w:t xml:space="preserve">Figure </w:t>
-                            </w:r>
-                            <w:proofErr w:type="gramStart"/>
-                            <w:r>
-                              <w:t>2:</w:t>
-                            </w:r>
-                            <w:proofErr w:type="gramEnd"/>
-                            <w:r>
-                              <w:t xml:space="preserve"> Plate Up ! (</w:t>
-                            </w:r>
-                            <w:proofErr w:type="gramStart"/>
-                            <w:r>
-                              <w:t>environ</w:t>
-                            </w:r>
-                            <w:proofErr w:type="gramEnd"/>
-                            <w:r>
-                              <w:t xml:space="preserve"> 1 million de copies vendus)</w:t>
+                              <w:t>Figure 2: Plate Up ! (environ 1 million de copies vendus)</w:t>
                             </w:r>
                           </w:p>
                         </w:txbxContent>
@@ -3053,15 +2940,7 @@
                                     </w:drawing>
                                   </w:r>
                                   <w:r>
-                                    <w:t xml:space="preserve">Figure </w:t>
-                                  </w:r>
-                                  <w:proofErr w:type="gramStart"/>
-                                  <w:r>
-                                    <w:t>3:</w:t>
-                                  </w:r>
-                                  <w:proofErr w:type="gramEnd"/>
-                                  <w:r>
-                                    <w:t xml:space="preserve"> Party Animals (environs 2 millions de copies vendus)</w:t>
+                                    <w:t>Figure 3: Party Animals (environs 2 millions de copies vendus)</w:t>
                                   </w:r>
                                 </w:p>
                               </w:txbxContent>
@@ -3135,15 +3014,7 @@
                               </w:drawing>
                             </w:r>
                             <w:r>
-                              <w:t xml:space="preserve">Figure </w:t>
-                            </w:r>
-                            <w:proofErr w:type="gramStart"/>
-                            <w:r>
-                              <w:t>3:</w:t>
-                            </w:r>
-                            <w:proofErr w:type="gramEnd"/>
-                            <w:r>
-                              <w:t xml:space="preserve"> Party Animals (environs 2 millions de copies vendus)</w:t>
+                              <w:t>Figure 3: Party Animals (environs 2 millions de copies vendus)</w:t>
                             </w:r>
                           </w:p>
                         </w:txbxContent>
@@ -3271,21 +3142,7 @@
                                     <w:rPr>
                                       <w:lang w:val="en-US"/>
                                     </w:rPr>
-                                    <w:t xml:space="preserve">Figure 4: You suck at </w:t>
-                                  </w:r>
-                                  <w:proofErr w:type="gramStart"/>
-                                  <w:r>
-                                    <w:rPr>
-                                      <w:lang w:val="en-US"/>
-                                    </w:rPr>
-                                    <w:t>parking !</w:t>
-                                  </w:r>
-                                  <w:proofErr w:type="gramEnd"/>
-                                  <w:r>
-                                    <w:rPr>
-                                      <w:lang w:val="en-US"/>
-                                    </w:rPr>
-                                    <w:t xml:space="preserve"> </w:t>
+                                    <w:t xml:space="preserve">Figure 4: You suck at parking ! </w:t>
                                   </w:r>
                                   <w:r>
                                     <w:t>(20 000 à 50 000 copies vendus)</w:t>
@@ -3365,21 +3222,7 @@
                               <w:rPr>
                                 <w:lang w:val="en-US"/>
                               </w:rPr>
-                              <w:t xml:space="preserve">Figure 4: You suck at </w:t>
-                            </w:r>
-                            <w:proofErr w:type="gramStart"/>
-                            <w:r>
-                              <w:rPr>
-                                <w:lang w:val="en-US"/>
-                              </w:rPr>
-                              <w:t>parking !</w:t>
-                            </w:r>
-                            <w:proofErr w:type="gramEnd"/>
-                            <w:r>
-                              <w:rPr>
-                                <w:lang w:val="en-US"/>
-                              </w:rPr>
-                              <w:t xml:space="preserve"> </w:t>
+                              <w:t xml:space="preserve">Figure 4: You suck at parking ! </w:t>
                             </w:r>
                             <w:r>
                               <w:t>(20 000 à 50 000 copies vendus)</w:t>
@@ -3556,29 +3399,13 @@
           <w:iCs/>
           <w:lang w:val="en-US"/>
         </w:rPr>
-        <w:t xml:space="preserve">Plate </w:t>
-      </w:r>
-      <w:proofErr w:type="gramStart"/>
-      <w:r>
-        <w:rPr>
-          <w:i/>
-          <w:iCs/>
+        <w:t>Plate Up!</w:t>
+      </w:r>
+      <w:r>
+        <w:rPr>
           <w:lang w:val="en-US"/>
         </w:rPr>
-        <w:t>Up!</w:t>
-      </w:r>
-      <w:r>
-        <w:rPr>
-          <w:lang w:val="en-US"/>
-        </w:rPr>
-        <w:t>,</w:t>
-      </w:r>
-      <w:proofErr w:type="gramEnd"/>
-      <w:r>
-        <w:rPr>
-          <w:lang w:val="en-US"/>
-        </w:rPr>
-        <w:t xml:space="preserve"> </w:t>
+        <w:t xml:space="preserve">, </w:t>
       </w:r>
       <w:r>
         <w:rPr>
@@ -4633,23 +4460,7 @@
           <w:i/>
           <w:iCs/>
         </w:rPr>
-        <w:t xml:space="preserve"> 2, Plate </w:t>
-      </w:r>
-      <w:proofErr w:type="gramStart"/>
-      <w:r>
-        <w:rPr>
-          <w:i/>
-          <w:iCs/>
-        </w:rPr>
-        <w:t>Up!,</w:t>
-      </w:r>
-      <w:proofErr w:type="gramEnd"/>
-      <w:r>
-        <w:rPr>
-          <w:i/>
-          <w:iCs/>
-        </w:rPr>
-        <w:t xml:space="preserve"> You </w:t>
+        <w:t xml:space="preserve"> 2, Plate Up!, You </w:t>
       </w:r>
       <w:proofErr w:type="spellStart"/>
       <w:r>
@@ -5109,7 +4920,13 @@
     </w:p>
     <w:p>
       <w:r>
-        <w:t>La répartition de l’enveloppe de rémunération entre les 6 membres de l’équipe :</w:t>
+        <w:t xml:space="preserve">La répartition de l’enveloppe de rémunération entre les </w:t>
+      </w:r>
+      <w:r>
+        <w:t>17</w:t>
+      </w:r>
+      <w:r>
+        <w:t xml:space="preserve"> membres de l’équipe :</w:t>
       </w:r>
     </w:p>
     <w:p>
@@ -5157,7 +4974,13 @@
         </w:numPr>
       </w:pPr>
       <w:r>
-        <w:t>4 programmeurs (2 étudiants de Master 2 – Informatique Gamagora –) : 363,85 euros chacun.</w:t>
+        <w:t>4 programmeurs (</w:t>
+      </w:r>
+      <w:r>
+        <w:t>4</w:t>
+      </w:r>
+      <w:r>
+        <w:t xml:space="preserve"> étudiants de Master 2 – Informatique Gamagora –) : 363,85 euros chacun.</w:t>
       </w:r>
     </w:p>
     <w:p>
@@ -5198,7 +5021,7 @@
         </w:numPr>
       </w:pPr>
       <w:r>
-        <w:t>Amélioration du multijoueur et création d’un matchmaking (40 %) : 2 328,67 euros.</w:t>
+        <w:t>Amélioration du multijoueur (40 %) : 2 328,67 euros.</w:t>
       </w:r>
     </w:p>
     <w:p>
@@ -5314,7 +5137,13 @@
     </w:p>
     <w:p>
       <w:r>
-        <w:t>La répartition de l’enveloppe de rémunération entre les 6 membres de l’équipe :</w:t>
+        <w:t xml:space="preserve">La répartition de l’enveloppe de rémunération entre les </w:t>
+      </w:r>
+      <w:r>
+        <w:t>17</w:t>
+      </w:r>
+      <w:r>
+        <w:t xml:space="preserve"> membres de l’équipe :</w:t>
       </w:r>
     </w:p>
     <w:p>
@@ -5362,7 +5191,13 @@
         </w:numPr>
       </w:pPr>
       <w:r>
-        <w:t>4 programmeurs (2 étudiants de Master 2 – Informatique Gamagora –) : 727,71 euros chacun.</w:t>
+        <w:t>4 programmeurs (</w:t>
+      </w:r>
+      <w:r>
+        <w:t>4</w:t>
+      </w:r>
+      <w:r>
+        <w:t xml:space="preserve"> étudiants de Master 2 – Informatique Gamagora –) : 727,71 euros chacun.</w:t>
       </w:r>
     </w:p>
     <w:p>
@@ -5403,7 +5238,24 @@
         </w:numPr>
       </w:pPr>
       <w:r>
-        <w:t>Amélioration du multijoueur et création d’un matchmaking (40 %) : 4 657,33 euros.</w:t>
+        <w:t>Amélioration du multijoueur</w:t>
+      </w:r>
+      <w:r>
+        <w:t>,</w:t>
+      </w:r>
+      <w:r>
+        <w:t xml:space="preserve"> création d’un </w:t>
+      </w:r>
+      <w:proofErr w:type="spellStart"/>
+      <w:r>
+        <w:t>matchmaking</w:t>
+      </w:r>
+      <w:proofErr w:type="spellEnd"/>
+      <w:r>
+        <w:t xml:space="preserve"> et un système de classement</w:t>
+      </w:r>
+      <w:r>
+        <w:t xml:space="preserve"> (40 %): 4 657,33 euros.</w:t>
       </w:r>
     </w:p>
     <w:p>
@@ -9219,6 +9071,7 @@
   <w:style w:type="character" w:default="1" w:styleId="Policepardfaut">
     <w:name w:val="Default Paragraph Font"/>
     <w:uiPriority w:val="1"/>
+    <w:semiHidden/>
     <w:unhideWhenUsed/>
   </w:style>
   <w:style w:type="table" w:default="1" w:styleId="TableauNormal">

</xml_diff>